<commit_message>
docs: sweep Studio of Ten → The Body Recode Collective in buildout docs
Swept the retired public brand out of the served SaaS-buildout docs
(prose only): "Studio of Ten" → "The Body Recode Collective", standalone
"SOT" → "Collective". KEPT "Founding Ten" / "founding partners" (the
programme concept), the "Studio" ladder tier, and all paths/enums.
Regenerated the .docx and the BR-branded .pdf from the swept markdown.

Co-Authored-By: Claude Opus 4.8 <noreply@anthropic.com>
</commit_message>
<xml_diff>
--- a/public/docs/saas-buildout/founding-ten/OFFER_ARCHITECTURE.docx
+++ b/public/docs/saas-buildout/founding-ten/OFFER_ARCHITECTURE.docx
@@ -28,7 +28,7 @@
         <w:pStyle w:val="BodyText"/>
       </w:pPr>
       <w:r>
-        <w:t xml:space="preserve">The productised offer: turn a movement or health practitioner’s own method into a branded, done-with-you coaching business, powered by the Body Recode engine and delivered through Studio of Ten. Capped at ten founding partners.</w:t>
+        <w:t xml:space="preserve">The productised offer: turn a movement or health practitioner’s own method into a branded, done-with-you coaching business, powered by the Body Recode engine and delivered through The Body Recode Collective. Capped at ten founding partners.</w:t>
       </w:r>
     </w:p>
     <w:p>
@@ -36,7 +36,7 @@
         <w:pStyle w:val="BodyText"/>
       </w:pPr>
       <w:r>
-        <w:t xml:space="preserve">This is the AI Co-Founder Method made concrete for one vertical, with the BR engine as the tech backbone and SOT as the delivery machine.</w:t>
+        <w:t xml:space="preserve">This is the AI Co-Founder Method made concrete for one vertical, with the BR engine as the tech backbone and Collective as the delivery machine.</w:t>
       </w:r>
     </w:p>
     <w:p>
@@ -558,7 +558,7 @@
               <w:pStyle w:val="Compact"/>
             </w:pPr>
             <w:r>
-              <w:t xml:space="preserve">Full SOT build: IP extraction, website, funnel, the lot</w:t>
+              <w:t xml:space="preserve">Full Collective build: IP extraction, website, funnel, the lot</w:t>
             </w:r>
           </w:p>
         </w:tc>
@@ -709,7 +709,7 @@
         <w:t xml:space="preserve"> </w:t>
       </w:r>
       <w:r>
-        <w:t xml:space="preserve">The full SOT engagement for a practitioner whose method still needs extracting and whose brand needs building.</w:t>
+        <w:t xml:space="preserve">The full Collective engagement for a practitioner whose method still needs extracting and whose brand needs building.</w:t>
       </w:r>
       <w:r>
         <w:t xml:space="preserve"> </w:t>
@@ -721,7 +721,7 @@
         <w:t xml:space="preserve"> </w:t>
       </w:r>
       <w:r>
-        <w:t xml:space="preserve">- IP extraction (SOT Stage 00) - their method becomes the engine’s doctrine/config</w:t>
+        <w:t xml:space="preserve">- IP extraction (Collective Stage 00) - their method becomes the engine’s doctrine/config</w:t>
       </w:r>
       <w:r>
         <w:t xml:space="preserve"> </w:t>
@@ -1578,13 +1578,13 @@
       </w:r>
     </w:p>
     <w:bookmarkEnd w:id="15"/>
-    <w:bookmarkStart w:id="16" w:name="delivery-flow-sot-is-the-machine"/>
+    <w:bookmarkStart w:id="16" w:name="Xedd4435cf2fa6071cd5267d95835967bb3a03a1"/>
     <w:p>
       <w:pPr>
         <w:pStyle w:val="Heading2"/>
       </w:pPr>
       <w:r>
-        <w:t xml:space="preserve">6. Delivery flow (SOT is the machine)</w:t>
+        <w:t xml:space="preserve">6. Delivery flow (the Collective is the machine)</w:t>
       </w:r>
     </w:p>
     <w:p>

</xml_diff>